<commit_message>
test: add test cases for REQ-3 and REQ-4
</commit_message>
<xml_diff>
--- a/Event_Management_Test_Plan.docx
+++ b/Event_Management_Test_Plan.docx
@@ -734,18 +734,8 @@
           <w:b/>
           <w:bCs/>
         </w:rPr>
-        <w:t xml:space="preserve">Test Case </w:t>
+        <w:t xml:space="preserve">Test Case ID :</w:t>
       </w:r>
-      <w:proofErr w:type="gramStart"/>
-      <w:r>
-        <w:rPr>
-          <w:rFonts w:ascii="Times New Roman" w:eastAsia="Times New Roman" w:hAnsi="Times New Roman" w:cs="Times New Roman"/>
-          <w:b/>
-          <w:bCs/>
-        </w:rPr>
-        <w:t>ID :</w:t>
-      </w:r>
-      <w:proofErr w:type="gramEnd"/>
       <w:r>
         <w:rPr>
           <w:rFonts w:ascii="Times New Roman" w:eastAsia="Times New Roman" w:hAnsi="Times New Roman" w:cs="Times New Roman"/>
@@ -775,19 +765,8 @@
           <w:bCs/>
           <w:color w:val="222222"/>
         </w:rPr>
-        <w:t xml:space="preserve">Name of the </w:t>
+        <w:t xml:space="preserve">Name of the module :</w:t>
       </w:r>
-      <w:proofErr w:type="gramStart"/>
-      <w:r>
-        <w:rPr>
-          <w:rFonts w:ascii="Times New Roman" w:eastAsia="Times New Roman" w:hAnsi="Times New Roman" w:cs="Times New Roman"/>
-          <w:b/>
-          <w:bCs/>
-          <w:color w:val="222222"/>
-        </w:rPr>
-        <w:t>module :</w:t>
-      </w:r>
-      <w:proofErr w:type="gramEnd"/>
       <w:r>
         <w:rPr>
           <w:rFonts w:ascii="Times New Roman" w:eastAsia="Times New Roman" w:hAnsi="Times New Roman" w:cs="Times New Roman"/>
@@ -834,27 +813,7 @@
           <w:bCs/>
           <w:color w:val="222222"/>
         </w:rPr>
-        <w:t xml:space="preserve">Test Case </w:t>
-      </w:r>
-      <w:proofErr w:type="gramStart"/>
-      <w:r>
-        <w:rPr>
-          <w:rFonts w:ascii="Times New Roman" w:eastAsia="Times New Roman" w:hAnsi="Times New Roman" w:cs="Times New Roman"/>
-          <w:b/>
-          <w:bCs/>
-          <w:color w:val="222222"/>
-        </w:rPr>
-        <w:t>Description :</w:t>
-      </w:r>
-      <w:proofErr w:type="gramEnd"/>
-      <w:r>
-        <w:rPr>
-          <w:rFonts w:ascii="Times New Roman" w:eastAsia="Times New Roman" w:hAnsi="Times New Roman" w:cs="Times New Roman"/>
-          <w:b/>
-          <w:bCs/>
-          <w:color w:val="222222"/>
-        </w:rPr>
-        <w:t xml:space="preserve"> </w:t>
+        <w:t xml:space="preserve">Test Case Description : </w:t>
       </w:r>
       <w:r>
         <w:rPr>
@@ -886,19 +845,8 @@
           <w:bCs/>
           <w:color w:val="222222"/>
         </w:rPr>
-        <w:t xml:space="preserve">Pre- </w:t>
+        <w:t xml:space="preserve">Pre- Conditions :</w:t>
       </w:r>
-      <w:proofErr w:type="gramStart"/>
-      <w:r>
-        <w:rPr>
-          <w:rFonts w:ascii="Times New Roman" w:eastAsia="Times New Roman" w:hAnsi="Times New Roman" w:cs="Times New Roman"/>
-          <w:b/>
-          <w:bCs/>
-          <w:color w:val="222222"/>
-        </w:rPr>
-        <w:t>Conditions :</w:t>
-      </w:r>
-      <w:proofErr w:type="gramEnd"/>
       <w:r>
         <w:rPr>
           <w:rFonts w:ascii="Times New Roman" w:eastAsia="Times New Roman" w:hAnsi="Times New Roman" w:cs="Times New Roman"/>
@@ -929,32 +877,14 @@
           <w:bCs/>
           <w:color w:val="222222"/>
         </w:rPr>
-        <w:t xml:space="preserve">Test </w:t>
-      </w:r>
-      <w:proofErr w:type="gramStart"/>
-      <w:r>
-        <w:rPr>
-          <w:rFonts w:ascii="Times New Roman" w:eastAsia="Times New Roman" w:hAnsi="Times New Roman" w:cs="Times New Roman"/>
-          <w:b/>
-          <w:bCs/>
-          <w:color w:val="222222"/>
-        </w:rPr>
-        <w:t>Steps</w:t>
+        <w:t xml:space="preserve">Test Steps</w:t>
       </w:r>
       <w:r>
         <w:rPr>
           <w:rFonts w:ascii="Times New Roman" w:eastAsia="Times New Roman" w:hAnsi="Times New Roman" w:cs="Times New Roman"/>
           <w:color w:val="222222"/>
         </w:rPr>
-        <w:t xml:space="preserve"> :</w:t>
-      </w:r>
-      <w:proofErr w:type="gramEnd"/>
-      <w:r>
-        <w:rPr>
-          <w:rFonts w:ascii="Times New Roman" w:eastAsia="Times New Roman" w:hAnsi="Times New Roman" w:cs="Times New Roman"/>
-          <w:color w:val="222222"/>
-        </w:rPr>
-        <w:t xml:space="preserve"> Mention all the steps in detail and specify the order in which it is to be executed. </w:t>
+        <w:t xml:space="preserve"> : Mention all the steps in detail and specify the order in which it is to be executed. </w:t>
       </w:r>
     </w:p>
     <w:p>
@@ -979,19 +909,8 @@
           <w:bCs/>
           <w:color w:val="222222"/>
         </w:rPr>
-        <w:t xml:space="preserve">Test </w:t>
+        <w:t xml:space="preserve">Test Data :</w:t>
       </w:r>
-      <w:proofErr w:type="gramStart"/>
-      <w:r>
-        <w:rPr>
-          <w:rFonts w:ascii="Times New Roman" w:eastAsia="Times New Roman" w:hAnsi="Times New Roman" w:cs="Times New Roman"/>
-          <w:b/>
-          <w:bCs/>
-          <w:color w:val="222222"/>
-        </w:rPr>
-        <w:t>Data :</w:t>
-      </w:r>
-      <w:proofErr w:type="gramEnd"/>
       <w:r>
         <w:rPr>
           <w:rFonts w:ascii="Times New Roman" w:eastAsia="Times New Roman" w:hAnsi="Times New Roman" w:cs="Times New Roman"/>
@@ -1022,19 +941,8 @@
           <w:bCs/>
           <w:color w:val="222222"/>
         </w:rPr>
-        <w:t xml:space="preserve">Expected </w:t>
+        <w:t xml:space="preserve">Expected Results :</w:t>
       </w:r>
-      <w:proofErr w:type="gramStart"/>
-      <w:r>
-        <w:rPr>
-          <w:rFonts w:ascii="Times New Roman" w:eastAsia="Times New Roman" w:hAnsi="Times New Roman" w:cs="Times New Roman"/>
-          <w:b/>
-          <w:bCs/>
-          <w:color w:val="222222"/>
-        </w:rPr>
-        <w:t>Results :</w:t>
-      </w:r>
-      <w:proofErr w:type="gramEnd"/>
       <w:r>
         <w:rPr>
           <w:rFonts w:ascii="Times New Roman" w:eastAsia="Times New Roman" w:hAnsi="Times New Roman" w:cs="Times New Roman"/>
@@ -1065,27 +973,7 @@
           <w:bCs/>
           <w:color w:val="222222"/>
         </w:rPr>
-        <w:t xml:space="preserve">Actual </w:t>
-      </w:r>
-      <w:proofErr w:type="gramStart"/>
-      <w:r>
-        <w:rPr>
-          <w:rFonts w:ascii="Times New Roman" w:eastAsia="Times New Roman" w:hAnsi="Times New Roman" w:cs="Times New Roman"/>
-          <w:b/>
-          <w:bCs/>
-          <w:color w:val="222222"/>
-        </w:rPr>
-        <w:t>Results :</w:t>
-      </w:r>
-      <w:proofErr w:type="gramEnd"/>
-      <w:r>
-        <w:rPr>
-          <w:rFonts w:ascii="Times New Roman" w:eastAsia="Times New Roman" w:hAnsi="Times New Roman" w:cs="Times New Roman"/>
-          <w:b/>
-          <w:bCs/>
-          <w:color w:val="222222"/>
-        </w:rPr>
-        <w:t xml:space="preserve"> </w:t>
+        <w:t xml:space="preserve">Actual Results : </w:t>
       </w:r>
       <w:r>
         <w:rPr>
@@ -1117,19 +1005,8 @@
           <w:bCs/>
           <w:color w:val="222222"/>
         </w:rPr>
-        <w:t>Test Result (Pass/Fail</w:t>
+        <w:t>Test Result (Pass/Fail) :</w:t>
       </w:r>
-      <w:proofErr w:type="gramStart"/>
-      <w:r>
-        <w:rPr>
-          <w:rFonts w:ascii="Times New Roman" w:eastAsia="Times New Roman" w:hAnsi="Times New Roman" w:cs="Times New Roman"/>
-          <w:b/>
-          <w:bCs/>
-          <w:color w:val="222222"/>
-        </w:rPr>
-        <w:t>) :</w:t>
-      </w:r>
-      <w:proofErr w:type="gramEnd"/>
       <w:r>
         <w:rPr>
           <w:rFonts w:ascii="Times New Roman" w:eastAsia="Times New Roman" w:hAnsi="Times New Roman" w:cs="Times New Roman"/>
@@ -1697,23 +1574,13 @@
                 <w:szCs w:val="18"/>
               </w:rPr>
             </w:pPr>
-            <w:proofErr w:type="gramStart"/>
             <w:r>
               <w:rPr>
                 <w:rFonts w:ascii="Times New Roman" w:eastAsia="Times New Roman" w:hAnsi="Times New Roman" w:cs="Times New Roman"/>
                 <w:sz w:val="18"/>
                 <w:szCs w:val="18"/>
               </w:rPr>
-              <w:t>Password :</w:t>
-            </w:r>
-            <w:proofErr w:type="gramEnd"/>
-            <w:r>
-              <w:rPr>
-                <w:rFonts w:ascii="Times New Roman" w:eastAsia="Times New Roman" w:hAnsi="Times New Roman" w:cs="Times New Roman"/>
-                <w:sz w:val="18"/>
-                <w:szCs w:val="18"/>
-              </w:rPr>
-              <w:t xml:space="preserve"> pes123</w:t>
+              <w:t xml:space="preserve">Password : pes123</w:t>
             </w:r>
           </w:p>
         </w:tc>
@@ -2073,14 +1940,7 @@
           <w:b/>
           <w:sz w:val="22"/>
         </w:rPr>
-        <w:t>Team 7</w:t>
-      </w:r>
-      <w:r>
-        <w:rPr>
-          <w:b/>
-          <w:sz w:val="22"/>
-        </w:rPr>
-        <w:t xml:space="preserve"> | REQ-1 and REQ-2</w:t>
+        <w:t xml:space="preserve">Team 7 | REQ-1 and REQ-2</w:t>
       </w:r>
     </w:p>
     <w:p>
@@ -2342,18 +2202,8 @@
                 <w:sz w:val="13"/>
               </w:rPr>
               <w:t>1. Open Create Event.</w:t>
-            </w:r>
-            <w:r>
-              <w:rPr>
-                <w:sz w:val="13"/>
-              </w:rPr>
               <w:br/>
               <w:t>2. Enter all fields.</w:t>
-            </w:r>
-            <w:r>
-              <w:rPr>
-                <w:sz w:val="13"/>
-              </w:rPr>
               <w:br/>
               <w:t>3. Submit.</w:t>
             </w:r>
@@ -2369,32 +2219,12 @@
                 <w:sz w:val="13"/>
               </w:rPr>
               <w:t>Name: Tech Fest</w:t>
-            </w:r>
-            <w:r>
-              <w:rPr>
-                <w:sz w:val="13"/>
-              </w:rPr>
               <w:br/>
               <w:t>Description: Annual tech event</w:t>
-            </w:r>
-            <w:r>
-              <w:rPr>
-                <w:sz w:val="13"/>
-              </w:rPr>
               <w:br/>
               <w:t>Date: 20-09-2026</w:t>
-            </w:r>
-            <w:r>
-              <w:rPr>
-                <w:sz w:val="13"/>
-              </w:rPr>
               <w:br/>
               <w:t>Time: 10:00 AM</w:t>
-            </w:r>
-            <w:r>
-              <w:rPr>
-                <w:sz w:val="13"/>
-              </w:rPr>
               <w:br/>
               <w:t>Location: PES University</w:t>
             </w:r>
@@ -2498,25 +2328,10 @@
                 <w:sz w:val="13"/>
               </w:rPr>
               <w:t>1. Open Create Event.</w:t>
-            </w:r>
-            <w:r>
-              <w:rPr>
-                <w:sz w:val="13"/>
-              </w:rPr>
               <w:br/>
               <w:t>2. Leave name empty.</w:t>
-            </w:r>
-            <w:r>
-              <w:rPr>
-                <w:sz w:val="13"/>
-              </w:rPr>
               <w:br/>
               <w:t>3. Fill other fields.</w:t>
-            </w:r>
-            <w:r>
-              <w:rPr>
-                <w:sz w:val="13"/>
-              </w:rPr>
               <w:br/>
               <w:t>4. Submit.</w:t>
             </w:r>
@@ -2633,25 +2448,10 @@
                 <w:sz w:val="13"/>
               </w:rPr>
               <w:t>1. Open Create Event.</w:t>
-            </w:r>
-            <w:r>
-              <w:rPr>
-                <w:sz w:val="13"/>
-              </w:rPr>
               <w:br/>
               <w:t>2. Leave description empty.</w:t>
-            </w:r>
-            <w:r>
-              <w:rPr>
-                <w:sz w:val="13"/>
-              </w:rPr>
               <w:br/>
               <w:t>3. Fill other fields.</w:t>
-            </w:r>
-            <w:r>
-              <w:rPr>
-                <w:sz w:val="13"/>
-              </w:rPr>
               <w:br/>
               <w:t>4. Submit.</w:t>
             </w:r>
@@ -2768,18 +2568,8 @@
                 <w:sz w:val="13"/>
               </w:rPr>
               <w:t>1. Open Create Event.</w:t>
-            </w:r>
-            <w:r>
-              <w:rPr>
-                <w:sz w:val="13"/>
-              </w:rPr>
               <w:br/>
               <w:t>2. Leave one required field empty.</w:t>
-            </w:r>
-            <w:r>
-              <w:rPr>
-                <w:sz w:val="13"/>
-              </w:rPr>
               <w:br/>
               <w:t>3. Submit.</w:t>
             </w:r>
@@ -2896,18 +2686,8 @@
                 <w:sz w:val="13"/>
               </w:rPr>
               <w:t>1. Open Create Event.</w:t>
-            </w:r>
-            <w:r>
-              <w:rPr>
-                <w:sz w:val="13"/>
-              </w:rPr>
               <w:br/>
               <w:t>2. Enter valid details.</w:t>
-            </w:r>
-            <w:r>
-              <w:rPr>
-                <w:sz w:val="13"/>
-              </w:rPr>
               <w:br/>
               <w:t>3. Submit.</w:t>
             </w:r>
@@ -3024,18 +2804,8 @@
                 <w:sz w:val="13"/>
               </w:rPr>
               <w:t>1. Enter valid event details.</w:t>
-            </w:r>
-            <w:r>
-              <w:rPr>
-                <w:sz w:val="13"/>
-              </w:rPr>
               <w:br/>
               <w:t>2. Submit.</w:t>
-            </w:r>
-            <w:r>
-              <w:rPr>
-                <w:sz w:val="13"/>
-              </w:rPr>
               <w:br/>
               <w:t>3. Verify event record.</w:t>
             </w:r>
@@ -3152,38 +2922,13 @@
                 <w:sz w:val="13"/>
               </w:rPr>
               <w:t>1. Login.</w:t>
-            </w:r>
-            <w:r>
-              <w:rPr>
-                <w:sz w:val="13"/>
-              </w:rPr>
               <w:br/>
               <w:t>2. Select Create Event.</w:t>
-            </w:r>
-            <w:r>
-              <w:rPr>
-                <w:sz w:val="13"/>
-              </w:rPr>
               <w:br/>
               <w:t>3. Enter details.</w:t>
-            </w:r>
-            <w:r>
-              <w:rPr>
-                <w:sz w:val="13"/>
-              </w:rPr>
               <w:br/>
               <w:t>4. Submit.</w:t>
-            </w:r>
-            <w:r>
-              <w:rPr>
-                <w:sz w:val="13"/>
-              </w:rPr>
               <w:br/>
-            </w:r>
-            <w:r>
-              <w:rPr>
-                <w:sz w:val="13"/>
-              </w:rPr>
               <w:t>5. Open organizer event list.</w:t>
             </w:r>
           </w:p>
@@ -3299,25 +3044,10 @@
                 <w:sz w:val="13"/>
               </w:rPr>
               <w:t>1. Login.</w:t>
-            </w:r>
-            <w:r>
-              <w:rPr>
-                <w:sz w:val="13"/>
-              </w:rPr>
               <w:br/>
               <w:t>2. Select Create Event.</w:t>
-            </w:r>
-            <w:r>
-              <w:rPr>
-                <w:sz w:val="13"/>
-              </w:rPr>
               <w:br/>
               <w:t>3. Leave required information missing.</w:t>
-            </w:r>
-            <w:r>
-              <w:rPr>
-                <w:sz w:val="13"/>
-              </w:rPr>
               <w:br/>
               <w:t>4. Submit.</w:t>
             </w:r>
@@ -3434,25 +3164,10 @@
                 <w:sz w:val="13"/>
               </w:rPr>
               <w:t>1. Open existing event.</w:t>
-            </w:r>
-            <w:r>
-              <w:rPr>
-                <w:sz w:val="13"/>
-              </w:rPr>
               <w:br/>
               <w:t>2. Select Edit.</w:t>
-            </w:r>
-            <w:r>
-              <w:rPr>
-                <w:sz w:val="13"/>
-              </w:rPr>
               <w:br/>
               <w:t>3. Change details.</w:t>
-            </w:r>
-            <w:r>
-              <w:rPr>
-                <w:sz w:val="13"/>
-              </w:rPr>
               <w:br/>
               <w:t>4. Save.</w:t>
             </w:r>
@@ -3569,18 +3284,8 @@
                 <w:sz w:val="13"/>
               </w:rPr>
               <w:t>1. Open event.</w:t>
-            </w:r>
-            <w:r>
-              <w:rPr>
-                <w:sz w:val="13"/>
-              </w:rPr>
               <w:br/>
               <w:t>2. Select Delete.</w:t>
-            </w:r>
-            <w:r>
-              <w:rPr>
-                <w:sz w:val="13"/>
-              </w:rPr>
               <w:br/>
               <w:t>3. Confirm deletion.</w:t>
             </w:r>
@@ -3697,18 +3402,8 @@
                 <w:sz w:val="13"/>
               </w:rPr>
               <w:t>1. Select Edit.</w:t>
-            </w:r>
-            <w:r>
-              <w:rPr>
-                <w:sz w:val="13"/>
-              </w:rPr>
               <w:br/>
               <w:t>2. Remove a required detail.</w:t>
-            </w:r>
-            <w:r>
-              <w:rPr>
-                <w:sz w:val="13"/>
-              </w:rPr>
               <w:br/>
               <w:t>3. Save.</w:t>
             </w:r>
@@ -3825,11 +3520,6 @@
                 <w:sz w:val="13"/>
               </w:rPr>
               <w:t>1. Login as Organizer B.</w:t>
-            </w:r>
-            <w:r>
-              <w:rPr>
-                <w:sz w:val="13"/>
-              </w:rPr>
               <w:br/>
               <w:t>2. Attempt to edit/delete Organizer A's event.</w:t>
             </w:r>
@@ -3946,25 +3636,10 @@
                 <w:sz w:val="13"/>
               </w:rPr>
               <w:t>1. Open event.</w:t>
-            </w:r>
-            <w:r>
-              <w:rPr>
-                <w:sz w:val="13"/>
-              </w:rPr>
               <w:br/>
               <w:t>2. Edit details.</w:t>
-            </w:r>
-            <w:r>
-              <w:rPr>
-                <w:sz w:val="13"/>
-              </w:rPr>
               <w:br/>
               <w:t>3. Save.</w:t>
-            </w:r>
-            <w:r>
-              <w:rPr>
-                <w:sz w:val="13"/>
-              </w:rPr>
               <w:br/>
               <w:t>4. Verify stored data.</w:t>
             </w:r>
@@ -4081,25 +3756,10 @@
                 <w:sz w:val="13"/>
               </w:rPr>
               <w:t>1. Select event.</w:t>
-            </w:r>
-            <w:r>
-              <w:rPr>
-                <w:sz w:val="13"/>
-              </w:rPr>
               <w:br/>
               <w:t>2. Delete it.</w:t>
-            </w:r>
-            <w:r>
-              <w:rPr>
-                <w:sz w:val="13"/>
-              </w:rPr>
               <w:br/>
               <w:t>3. Confirm.</w:t>
-            </w:r>
-            <w:r>
-              <w:rPr>
-                <w:sz w:val="13"/>
-              </w:rPr>
               <w:br/>
               <w:t>4. Check event list.</w:t>
             </w:r>
@@ -4216,32 +3876,12 @@
                 <w:sz w:val="13"/>
               </w:rPr>
               <w:t>1. Login.</w:t>
-            </w:r>
-            <w:r>
-              <w:rPr>
-                <w:sz w:val="13"/>
-              </w:rPr>
               <w:br/>
               <w:t>2. Open event.</w:t>
-            </w:r>
-            <w:r>
-              <w:rPr>
-                <w:sz w:val="13"/>
-              </w:rPr>
               <w:br/>
               <w:t>3. Edit details.</w:t>
-            </w:r>
-            <w:r>
-              <w:rPr>
-                <w:sz w:val="13"/>
-              </w:rPr>
               <w:br/>
               <w:t>4. Save.</w:t>
-            </w:r>
-            <w:r>
-              <w:rPr>
-                <w:sz w:val="13"/>
-              </w:rPr>
               <w:br/>
               <w:t>5. Reopen event.</w:t>
             </w:r>
@@ -4358,31 +3998,11 @@
                 <w:sz w:val="13"/>
               </w:rPr>
               <w:t>1. Login as owner.</w:t>
-            </w:r>
-            <w:r>
-              <w:rPr>
-                <w:sz w:val="13"/>
-              </w:rPr>
               <w:br/>
               <w:t>2. Delete own event.</w:t>
-            </w:r>
-            <w:r>
-              <w:rPr>
-                <w:sz w:val="13"/>
-              </w:rPr>
               <w:br/>
               <w:t>3. Verify removal.</w:t>
-            </w:r>
-            <w:r>
-              <w:rPr>
-                <w:sz w:val="13"/>
-              </w:rPr>
               <w:br/>
-            </w:r>
-            <w:r>
-              <w:rPr>
-                <w:sz w:val="13"/>
-              </w:rPr>
               <w:lastRenderedPageBreak/>
               <w:t>4. Login as another organizer and attempt to manage another user's event.</w:t>
             </w:r>
@@ -4412,13 +4032,2173 @@
                 <w:sz w:val="13"/>
               </w:rPr>
               <w:t xml:space="preserve">Owner should be able to delete their event, while another </w:t>
-            </w:r>
-            <w:r>
-              <w:rPr>
-                <w:sz w:val="13"/>
-              </w:rPr>
               <w:lastRenderedPageBreak/>
               <w:t>organizer should not be allowed to manage someone else's event.</w:t>
+            </w:r>
+          </w:p>
+        </w:tc>
+        <w:tc>
+          <w:tcPr>
+            <w:tcW w:w="1759" w:type="dxa"/>
+          </w:tcPr>
+          <w:p/>
+        </w:tc>
+        <w:tc>
+          <w:tcPr>
+            <w:tcW w:w="1759" w:type="dxa"/>
+          </w:tcPr>
+          <w:p/>
+        </w:tc>
+      </w:tr>
+    </w:tbl>
+    <w:p>
+      <w:r>
+        <w:br w:type="page"/>
+      </w:r>
+    </w:p>
+    <w:p>
+      <w:pPr>
+        <w:jc w:val="center"/>
+      </w:pPr>
+      <w:r>
+        <w:rPr>
+          <w:b/>
+          <w:sz w:val="22"/>
+        </w:rPr>
+        <w:t xml:space="preserve">Team 7 | REQ-3 and REQ-4</w:t>
+      </w:r>
+    </w:p>
+    <w:p>
+      <w:r>
+        <w:rPr>
+          <w:b/>
+        </w:rPr>
+        <w:t xml:space="preserve">Note: </w:t>
+      </w:r>
+      <w:r>
+        <w:t>Actual Result and Test Result are left blank until manual testing is carried out, as instructed in the provided Test Plan.</w:t>
+      </w:r>
+    </w:p>
+    <w:tbl>
+      <w:tblPr>
+        <w:tblW w:w="0" w:type="auto"/>
+        <w:jc w:val="center"/>
+        <w:tblBorders>
+          <w:top w:val="single" w:sz="4" w:space="0" w:color="000000"/>
+          <w:left w:val="single" w:sz="4" w:space="0" w:color="000000"/>
+          <w:bottom w:val="single" w:sz="4" w:space="0" w:color="000000"/>
+          <w:right w:val="single" w:sz="4" w:space="0" w:color="000000"/>
+          <w:insideH w:val="single" w:sz="4" w:space="0" w:color="000000"/>
+          <w:insideV w:val="single" w:sz="4" w:space="0" w:color="000000"/>
+        </w:tblBorders>
+        <w:tblCellMar>
+          <w:left w:w="10" w:type="dxa"/>
+          <w:right w:w="10" w:type="dxa"/>
+        </w:tblCellMar>
+        <w:tblLook w:val="04A0" w:firstRow="1" w:lastRow="0" w:firstColumn="1" w:lastColumn="0" w:noHBand="0" w:noVBand="1"/>
+      </w:tblPr>
+      <w:tblGrid>
+        <w:gridCol w:w="1757"/>
+        <w:gridCol w:w="1758"/>
+        <w:gridCol w:w="1758"/>
+        <w:gridCol w:w="1758"/>
+        <w:gridCol w:w="1758"/>
+        <w:gridCol w:w="1759"/>
+        <w:gridCol w:w="1758"/>
+        <w:gridCol w:w="1757"/>
+        <w:gridCol w:w="1757"/>
+      </w:tblGrid>
+      <w:tr>
+        <w:tblPrEx>
+          <w:tblCellMar>
+            <w:top w:w="0" w:type="dxa"/>
+            <w:bottom w:w="0" w:type="dxa"/>
+          </w:tblCellMar>
+        </w:tblPrEx>
+        <w:trPr>
+          <w:tblHeader/>
+          <w:jc w:val="center"/>
+        </w:trPr>
+        <w:tc>
+          <w:tcPr>
+            <w:tcW w:w="1759" w:type="dxa"/>
+            <w:vAlign w:val="center"/>
+          </w:tcPr>
+          <w:p>
+            <w:r>
+              <w:rPr>
+                <w:b/>
+                <w:sz w:val="14"/>
+              </w:rPr>
+              <w:t>Test Case ID</w:t>
+            </w:r>
+          </w:p>
+        </w:tc>
+        <w:tc>
+          <w:tcPr>
+            <w:tcW w:w="1759" w:type="dxa"/>
+            <w:vAlign w:val="center"/>
+          </w:tcPr>
+          <w:p>
+            <w:r>
+              <w:rPr>
+                <w:b/>
+                <w:sz w:val="14"/>
+              </w:rPr>
+              <w:t>Name of Module</w:t>
+            </w:r>
+          </w:p>
+        </w:tc>
+        <w:tc>
+          <w:tcPr>
+            <w:tcW w:w="1759" w:type="dxa"/>
+            <w:vAlign w:val="center"/>
+          </w:tcPr>
+          <w:p>
+            <w:r>
+              <w:rPr>
+                <w:b/>
+                <w:sz w:val="14"/>
+              </w:rPr>
+              <w:t>Test case description</w:t>
+            </w:r>
+          </w:p>
+        </w:tc>
+        <w:tc>
+          <w:tcPr>
+            <w:tcW w:w="1759" w:type="dxa"/>
+            <w:vAlign w:val="center"/>
+          </w:tcPr>
+          <w:p>
+            <w:r>
+              <w:rPr>
+                <w:b/>
+                <w:sz w:val="14"/>
+              </w:rPr>
+              <w:t>Pre-conditions</w:t>
+            </w:r>
+          </w:p>
+        </w:tc>
+        <w:tc>
+          <w:tcPr>
+            <w:tcW w:w="1759" w:type="dxa"/>
+            <w:vAlign w:val="center"/>
+          </w:tcPr>
+          <w:p>
+            <w:r>
+              <w:rPr>
+                <w:b/>
+                <w:sz w:val="14"/>
+              </w:rPr>
+              <w:t>Test Steps</w:t>
+            </w:r>
+          </w:p>
+        </w:tc>
+        <w:tc>
+          <w:tcPr>
+            <w:tcW w:w="1759" w:type="dxa"/>
+            <w:vAlign w:val="center"/>
+          </w:tcPr>
+          <w:p>
+            <w:r>
+              <w:rPr>
+                <w:b/>
+                <w:sz w:val="14"/>
+              </w:rPr>
+              <w:t>Test data</w:t>
+            </w:r>
+          </w:p>
+        </w:tc>
+        <w:tc>
+          <w:tcPr>
+            <w:tcW w:w="1759" w:type="dxa"/>
+            <w:vAlign w:val="center"/>
+          </w:tcPr>
+          <w:p>
+            <w:r>
+              <w:rPr>
+                <w:b/>
+                <w:sz w:val="14"/>
+              </w:rPr>
+              <w:t>Expected Results</w:t>
+            </w:r>
+          </w:p>
+        </w:tc>
+        <w:tc>
+          <w:tcPr>
+            <w:tcW w:w="1759" w:type="dxa"/>
+            <w:vAlign w:val="center"/>
+          </w:tcPr>
+          <w:p>
+            <w:r>
+              <w:rPr>
+                <w:b/>
+                <w:sz w:val="14"/>
+              </w:rPr>
+              <w:t>Actual Result</w:t>
+            </w:r>
+          </w:p>
+        </w:tc>
+        <w:tc>
+          <w:tcPr>
+            <w:tcW w:w="1759" w:type="dxa"/>
+            <w:vAlign w:val="center"/>
+          </w:tcPr>
+          <w:p>
+            <w:r>
+              <w:rPr>
+                <w:b/>
+                <w:sz w:val="14"/>
+              </w:rPr>
+              <w:t>Test Result</w:t>
+            </w:r>
+          </w:p>
+        </w:tc>
+      </w:tr>
+      <w:tr>
+        <w:tblPrEx>
+          <w:tblCellMar>
+            <w:top w:w="0" w:type="dxa"/>
+            <w:bottom w:w="0" w:type="dxa"/>
+          </w:tblCellMar>
+        </w:tblPrEx>
+        <w:trPr>
+          <w:jc w:val="center"/>
+        </w:trPr>
+        <w:tc>
+          <w:tcPr>
+            <w:tcW w:w="1759" w:type="dxa"/>
+          </w:tcPr>
+          <w:p>
+            <w:r>
+              <w:rPr>
+                <w:sz w:val="13"/>
+              </w:rPr>
+              <w:t>REQ3_UT_01</w:t>
+            </w:r>
+          </w:p>
+        </w:tc>
+        <w:tc>
+          <w:tcPr>
+            <w:tcW w:w="1759" w:type="dxa"/>
+          </w:tcPr>
+          <w:p>
+            <w:r>
+              <w:rPr>
+                <w:sz w:val="13"/>
+              </w:rPr>
+              <w:t>Event Listing</w:t>
+            </w:r>
+          </w:p>
+        </w:tc>
+        <w:tc>
+          <w:tcPr>
+            <w:tcW w:w="1759" w:type="dxa"/>
+          </w:tcPr>
+          <w:p>
+            <w:r>
+              <w:rPr>
+                <w:sz w:val="13"/>
+              </w:rPr>
+              <w:t>View list of upcoming events</w:t>
+            </w:r>
+          </w:p>
+        </w:tc>
+        <w:tc>
+          <w:tcPr>
+            <w:tcW w:w="1759" w:type="dxa"/>
+          </w:tcPr>
+          <w:p>
+            <w:r>
+              <w:rPr>
+                <w:sz w:val="13"/>
+              </w:rPr>
+              <w:t>Events exist in system</w:t>
+            </w:r>
+          </w:p>
+        </w:tc>
+        <w:tc>
+          <w:tcPr>
+            <w:tcW w:w="1759" w:type="dxa"/>
+          </w:tcPr>
+          <w:p>
+            <w:r>
+              <w:rPr>
+                <w:sz w:val="13"/>
+              </w:rPr>
+              <w:t>1. Open events page</w:t>
+            </w:r>
+          </w:p>
+        </w:tc>
+        <w:tc>
+          <w:tcPr>
+            <w:tcW w:w="1759" w:type="dxa"/>
+          </w:tcPr>
+          <w:p>
+            <w:r>
+              <w:rPr>
+                <w:sz w:val="13"/>
+              </w:rPr>
+              <w:t>Valid upcoming events in DB</w:t>
+            </w:r>
+          </w:p>
+        </w:tc>
+        <w:tc>
+          <w:tcPr>
+            <w:tcW w:w="1759" w:type="dxa"/>
+          </w:tcPr>
+          <w:p>
+            <w:r>
+              <w:rPr>
+                <w:sz w:val="13"/>
+              </w:rPr>
+              <w:t>List of upcoming events is displayed</w:t>
+            </w:r>
+          </w:p>
+        </w:tc>
+        <w:tc>
+          <w:tcPr>
+            <w:tcW w:w="1759" w:type="dxa"/>
+          </w:tcPr>
+          <w:p/>
+        </w:tc>
+        <w:tc>
+          <w:tcPr>
+            <w:tcW w:w="1759" w:type="dxa"/>
+          </w:tcPr>
+          <w:p/>
+        </w:tc>
+      </w:tr>
+      <w:tr>
+        <w:tblPrEx>
+          <w:tblCellMar>
+            <w:top w:w="0" w:type="dxa"/>
+            <w:bottom w:w="0" w:type="dxa"/>
+          </w:tblCellMar>
+        </w:tblPrEx>
+        <w:trPr>
+          <w:jc w:val="center"/>
+        </w:trPr>
+        <w:tc>
+          <w:tcPr>
+            <w:tcW w:w="1759" w:type="dxa"/>
+          </w:tcPr>
+          <w:p>
+            <w:r>
+              <w:rPr>
+                <w:sz w:val="13"/>
+              </w:rPr>
+              <w:t>REQ3_UT_02</w:t>
+            </w:r>
+          </w:p>
+        </w:tc>
+        <w:tc>
+          <w:tcPr>
+            <w:tcW w:w="1759" w:type="dxa"/>
+          </w:tcPr>
+          <w:p>
+            <w:r>
+              <w:rPr>
+                <w:sz w:val="13"/>
+              </w:rPr>
+              <w:t>Event Details</w:t>
+            </w:r>
+          </w:p>
+        </w:tc>
+        <w:tc>
+          <w:tcPr>
+            <w:tcW w:w="1759" w:type="dxa"/>
+          </w:tcPr>
+          <w:p>
+            <w:r>
+              <w:rPr>
+                <w:sz w:val="13"/>
+              </w:rPr>
+              <w:t>View details of a selected event</w:t>
+            </w:r>
+          </w:p>
+        </w:tc>
+        <w:tc>
+          <w:tcPr>
+            <w:tcW w:w="1759" w:type="dxa"/>
+          </w:tcPr>
+          <w:p>
+            <w:r>
+              <w:rPr>
+                <w:sz w:val="13"/>
+              </w:rPr>
+              <w:t>At least one event exists</w:t>
+            </w:r>
+          </w:p>
+        </w:tc>
+        <w:tc>
+          <w:tcPr>
+            <w:tcW w:w="1759" w:type="dxa"/>
+          </w:tcPr>
+          <w:p>
+            <w:r>
+              <w:rPr>
+                <w:sz w:val="13"/>
+              </w:rPr>
+              <w:t>1. Click an event from the list</w:t>
+            </w:r>
+          </w:p>
+        </w:tc>
+        <w:tc>
+          <w:tcPr>
+            <w:tcW w:w="1759" w:type="dxa"/>
+          </w:tcPr>
+          <w:p>
+            <w:r>
+              <w:rPr>
+                <w:sz w:val="13"/>
+              </w:rPr>
+              <w:t>Existing event</w:t>
+            </w:r>
+          </w:p>
+        </w:tc>
+        <w:tc>
+          <w:tcPr>
+            <w:tcW w:w="1759" w:type="dxa"/>
+          </w:tcPr>
+          <w:p>
+            <w:r>
+              <w:rPr>
+                <w:sz w:val="13"/>
+              </w:rPr>
+              <w:t>Full event details (name, description, date, time, location) are shown</w:t>
+            </w:r>
+          </w:p>
+        </w:tc>
+        <w:tc>
+          <w:tcPr>
+            <w:tcW w:w="1759" w:type="dxa"/>
+          </w:tcPr>
+          <w:p/>
+        </w:tc>
+        <w:tc>
+          <w:tcPr>
+            <w:tcW w:w="1759" w:type="dxa"/>
+          </w:tcPr>
+          <w:p/>
+        </w:tc>
+      </w:tr>
+      <w:tr>
+        <w:tblPrEx>
+          <w:tblCellMar>
+            <w:top w:w="0" w:type="dxa"/>
+            <w:bottom w:w="0" w:type="dxa"/>
+          </w:tblCellMar>
+        </w:tblPrEx>
+        <w:trPr>
+          <w:jc w:val="center"/>
+        </w:trPr>
+        <w:tc>
+          <w:tcPr>
+            <w:tcW w:w="1759" w:type="dxa"/>
+          </w:tcPr>
+          <w:p>
+            <w:r>
+              <w:rPr>
+                <w:sz w:val="13"/>
+              </w:rPr>
+              <w:t>REQ3_UT_03</w:t>
+            </w:r>
+          </w:p>
+        </w:tc>
+        <w:tc>
+          <w:tcPr>
+            <w:tcW w:w="1759" w:type="dxa"/>
+          </w:tcPr>
+          <w:p>
+            <w:r>
+              <w:rPr>
+                <w:sz w:val="13"/>
+              </w:rPr>
+              <w:t>Event Listing</w:t>
+            </w:r>
+          </w:p>
+        </w:tc>
+        <w:tc>
+          <w:tcPr>
+            <w:tcW w:w="1759" w:type="dxa"/>
+          </w:tcPr>
+          <w:p>
+            <w:r>
+              <w:rPr>
+                <w:sz w:val="13"/>
+              </w:rPr>
+              <w:t>Empty state - no upcoming events</w:t>
+            </w:r>
+          </w:p>
+        </w:tc>
+        <w:tc>
+          <w:tcPr>
+            <w:tcW w:w="1759" w:type="dxa"/>
+          </w:tcPr>
+          <w:p>
+            <w:r>
+              <w:rPr>
+                <w:sz w:val="13"/>
+              </w:rPr>
+              <w:t>No events in system</w:t>
+            </w:r>
+          </w:p>
+        </w:tc>
+        <w:tc>
+          <w:tcPr>
+            <w:tcW w:w="1759" w:type="dxa"/>
+          </w:tcPr>
+          <w:p>
+            <w:r>
+              <w:rPr>
+                <w:sz w:val="13"/>
+              </w:rPr>
+              <w:t>1. Open events page</w:t>
+            </w:r>
+          </w:p>
+        </w:tc>
+        <w:tc>
+          <w:tcPr>
+            <w:tcW w:w="1759" w:type="dxa"/>
+          </w:tcPr>
+          <w:p>
+            <w:r>
+              <w:rPr>
+                <w:sz w:val="13"/>
+              </w:rPr>
+              <w:t>No events</w:t>
+            </w:r>
+          </w:p>
+        </w:tc>
+        <w:tc>
+          <w:tcPr>
+            <w:tcW w:w="1759" w:type="dxa"/>
+          </w:tcPr>
+          <w:p>
+            <w:r>
+              <w:rPr>
+                <w:sz w:val="13"/>
+              </w:rPr>
+              <w:t>System shows an appropriate 'no events' message instead of an error</w:t>
+            </w:r>
+          </w:p>
+        </w:tc>
+        <w:tc>
+          <w:tcPr>
+            <w:tcW w:w="1759" w:type="dxa"/>
+          </w:tcPr>
+          <w:p/>
+        </w:tc>
+        <w:tc>
+          <w:tcPr>
+            <w:tcW w:w="1759" w:type="dxa"/>
+          </w:tcPr>
+          <w:p/>
+        </w:tc>
+      </w:tr>
+      <w:tr>
+        <w:tblPrEx>
+          <w:tblCellMar>
+            <w:top w:w="0" w:type="dxa"/>
+            <w:bottom w:w="0" w:type="dxa"/>
+          </w:tblCellMar>
+        </w:tblPrEx>
+        <w:trPr>
+          <w:jc w:val="center"/>
+        </w:trPr>
+        <w:tc>
+          <w:tcPr>
+            <w:tcW w:w="1759" w:type="dxa"/>
+          </w:tcPr>
+          <w:p>
+            <w:r>
+              <w:rPr>
+                <w:sz w:val="13"/>
+              </w:rPr>
+              <w:t>REQ3_UT_04</w:t>
+            </w:r>
+          </w:p>
+        </w:tc>
+        <w:tc>
+          <w:tcPr>
+            <w:tcW w:w="1759" w:type="dxa"/>
+          </w:tcPr>
+          <w:p>
+            <w:r>
+              <w:rPr>
+                <w:sz w:val="13"/>
+              </w:rPr>
+              <w:t>Event Details</w:t>
+            </w:r>
+          </w:p>
+        </w:tc>
+        <w:tc>
+          <w:tcPr>
+            <w:tcW w:w="1759" w:type="dxa"/>
+          </w:tcPr>
+          <w:p>
+            <w:r>
+              <w:rPr>
+                <w:sz w:val="13"/>
+              </w:rPr>
+              <w:t>Attempt to view a non-existent or invalid event</w:t>
+            </w:r>
+          </w:p>
+        </w:tc>
+        <w:tc>
+          <w:tcPr>
+            <w:tcW w:w="1759" w:type="dxa"/>
+          </w:tcPr>
+          <w:p>
+            <w:r>
+              <w:rPr>
+                <w:sz w:val="13"/>
+              </w:rPr>
+              <w:t>-</w:t>
+            </w:r>
+          </w:p>
+        </w:tc>
+        <w:tc>
+          <w:tcPr>
+            <w:tcW w:w="1759" w:type="dxa"/>
+          </w:tcPr>
+          <w:p>
+            <w:r>
+              <w:rPr>
+                <w:sz w:val="13"/>
+              </w:rPr>
+              <w:t>1. Navigate to an invalid event URL/ID</w:t>
+            </w:r>
+          </w:p>
+        </w:tc>
+        <w:tc>
+          <w:tcPr>
+            <w:tcW w:w="1759" w:type="dxa"/>
+          </w:tcPr>
+          <w:p>
+            <w:r>
+              <w:rPr>
+                <w:sz w:val="13"/>
+              </w:rPr>
+              <w:t>Invalid event ID</w:t>
+            </w:r>
+          </w:p>
+        </w:tc>
+        <w:tc>
+          <w:tcPr>
+            <w:tcW w:w="1759" w:type="dxa"/>
+          </w:tcPr>
+          <w:p>
+            <w:r>
+              <w:rPr>
+                <w:sz w:val="13"/>
+              </w:rPr>
+              <w:t>System shows an appropriate error, not a crash</w:t>
+            </w:r>
+          </w:p>
+        </w:tc>
+        <w:tc>
+          <w:tcPr>
+            <w:tcW w:w="1759" w:type="dxa"/>
+          </w:tcPr>
+          <w:p/>
+        </w:tc>
+        <w:tc>
+          <w:tcPr>
+            <w:tcW w:w="1759" w:type="dxa"/>
+          </w:tcPr>
+          <w:p/>
+        </w:tc>
+      </w:tr>
+      <w:tr>
+        <w:tblPrEx>
+          <w:tblCellMar>
+            <w:top w:w="0" w:type="dxa"/>
+            <w:bottom w:w="0" w:type="dxa"/>
+          </w:tblCellMar>
+        </w:tblPrEx>
+        <w:trPr>
+          <w:jc w:val="center"/>
+        </w:trPr>
+        <w:tc>
+          <w:tcPr>
+            <w:tcW w:w="1759" w:type="dxa"/>
+          </w:tcPr>
+          <w:p>
+            <w:r>
+              <w:rPr>
+                <w:sz w:val="13"/>
+              </w:rPr>
+              <w:t>REQ3_IT_01</w:t>
+            </w:r>
+          </w:p>
+        </w:tc>
+        <w:tc>
+          <w:tcPr>
+            <w:tcW w:w="1759" w:type="dxa"/>
+          </w:tcPr>
+          <w:p>
+            <w:r>
+              <w:rPr>
+                <w:sz w:val="13"/>
+              </w:rPr>
+              <w:t>Frontend + Backend</w:t>
+            </w:r>
+          </w:p>
+        </w:tc>
+        <w:tc>
+          <w:tcPr>
+            <w:tcW w:w="1759" w:type="dxa"/>
+          </w:tcPr>
+          <w:p>
+            <w:r>
+              <w:rPr>
+                <w:sz w:val="13"/>
+              </w:rPr>
+              <w:t>Frontend correctly fetches event list from backend</w:t>
+            </w:r>
+          </w:p>
+        </w:tc>
+        <w:tc>
+          <w:tcPr>
+            <w:tcW w:w="1759" w:type="dxa"/>
+          </w:tcPr>
+          <w:p>
+            <w:r>
+              <w:rPr>
+                <w:sz w:val="13"/>
+              </w:rPr>
+              <w:t>Backend running, events exist</w:t>
+            </w:r>
+          </w:p>
+        </w:tc>
+        <w:tc>
+          <w:tcPr>
+            <w:tcW w:w="1759" w:type="dxa"/>
+          </w:tcPr>
+          <w:p>
+            <w:r>
+              <w:rPr>
+                <w:sz w:val="13"/>
+              </w:rPr>
+              <w:t>1. Load events page</w:t>
+            </w:r>
+          </w:p>
+        </w:tc>
+        <w:tc>
+          <w:tcPr>
+            <w:tcW w:w="1759" w:type="dxa"/>
+          </w:tcPr>
+          <w:p>
+            <w:r>
+              <w:rPr>
+                <w:sz w:val="13"/>
+              </w:rPr>
+              <w:t>Valid events</w:t>
+            </w:r>
+          </w:p>
+        </w:tc>
+        <w:tc>
+          <w:tcPr>
+            <w:tcW w:w="1759" w:type="dxa"/>
+          </w:tcPr>
+          <w:p>
+            <w:r>
+              <w:rPr>
+                <w:sz w:val="13"/>
+              </w:rPr>
+              <w:t>Frontend displays exactly the events returned by the API</w:t>
+            </w:r>
+          </w:p>
+        </w:tc>
+        <w:tc>
+          <w:tcPr>
+            <w:tcW w:w="1759" w:type="dxa"/>
+          </w:tcPr>
+          <w:p/>
+        </w:tc>
+        <w:tc>
+          <w:tcPr>
+            <w:tcW w:w="1759" w:type="dxa"/>
+          </w:tcPr>
+          <w:p/>
+        </w:tc>
+      </w:tr>
+      <w:tr>
+        <w:tblPrEx>
+          <w:tblCellMar>
+            <w:top w:w="0" w:type="dxa"/>
+            <w:bottom w:w="0" w:type="dxa"/>
+          </w:tblCellMar>
+        </w:tblPrEx>
+        <w:trPr>
+          <w:jc w:val="center"/>
+        </w:trPr>
+        <w:tc>
+          <w:tcPr>
+            <w:tcW w:w="1759" w:type="dxa"/>
+          </w:tcPr>
+          <w:p>
+            <w:r>
+              <w:rPr>
+                <w:sz w:val="13"/>
+              </w:rPr>
+              <w:t>REQ3_IT_02</w:t>
+            </w:r>
+          </w:p>
+        </w:tc>
+        <w:tc>
+          <w:tcPr>
+            <w:tcW w:w="1759" w:type="dxa"/>
+          </w:tcPr>
+          <w:p>
+            <w:r>
+              <w:rPr>
+                <w:sz w:val="13"/>
+              </w:rPr>
+              <w:t>Backend + Database</w:t>
+            </w:r>
+          </w:p>
+        </w:tc>
+        <w:tc>
+          <w:tcPr>
+            <w:tcW w:w="1759" w:type="dxa"/>
+          </w:tcPr>
+          <w:p>
+            <w:r>
+              <w:rPr>
+                <w:sz w:val="13"/>
+              </w:rPr>
+              <w:t>Backend retrieves correct event details from database</w:t>
+            </w:r>
+          </w:p>
+        </w:tc>
+        <w:tc>
+          <w:tcPr>
+            <w:tcW w:w="1759" w:type="dxa"/>
+          </w:tcPr>
+          <w:p>
+            <w:r>
+              <w:rPr>
+                <w:sz w:val="13"/>
+              </w:rPr>
+              <w:t>Event exists in DB</w:t>
+            </w:r>
+          </w:p>
+        </w:tc>
+        <w:tc>
+          <w:tcPr>
+            <w:tcW w:w="1759" w:type="dxa"/>
+          </w:tcPr>
+          <w:p>
+            <w:r>
+              <w:rPr>
+                <w:sz w:val="13"/>
+              </w:rPr>
+              <w:t>1. Request details for a specific event ID</w:t>
+            </w:r>
+          </w:p>
+        </w:tc>
+        <w:tc>
+          <w:tcPr>
+            <w:tcW w:w="1759" w:type="dxa"/>
+          </w:tcPr>
+          <w:p>
+            <w:r>
+              <w:rPr>
+                <w:sz w:val="13"/>
+              </w:rPr>
+              <w:t>Existing event ID</w:t>
+            </w:r>
+          </w:p>
+        </w:tc>
+        <w:tc>
+          <w:tcPr>
+            <w:tcW w:w="1759" w:type="dxa"/>
+          </w:tcPr>
+          <w:p>
+            <w:r>
+              <w:rPr>
+                <w:sz w:val="13"/>
+              </w:rPr>
+              <w:t>Correct event record is returned from the database</w:t>
+            </w:r>
+          </w:p>
+        </w:tc>
+        <w:tc>
+          <w:tcPr>
+            <w:tcW w:w="1759" w:type="dxa"/>
+          </w:tcPr>
+          <w:p/>
+        </w:tc>
+        <w:tc>
+          <w:tcPr>
+            <w:tcW w:w="1759" w:type="dxa"/>
+          </w:tcPr>
+          <w:p/>
+        </w:tc>
+      </w:tr>
+      <w:tr>
+        <w:tblPrEx>
+          <w:tblCellMar>
+            <w:top w:w="0" w:type="dxa"/>
+            <w:bottom w:w="0" w:type="dxa"/>
+          </w:tblCellMar>
+        </w:tblPrEx>
+        <w:trPr>
+          <w:jc w:val="center"/>
+        </w:trPr>
+        <w:tc>
+          <w:tcPr>
+            <w:tcW w:w="1759" w:type="dxa"/>
+          </w:tcPr>
+          <w:p>
+            <w:r>
+              <w:rPr>
+                <w:sz w:val="13"/>
+              </w:rPr>
+              <w:t>REQ3_ST_01</w:t>
+            </w:r>
+          </w:p>
+        </w:tc>
+        <w:tc>
+          <w:tcPr>
+            <w:tcW w:w="1759" w:type="dxa"/>
+          </w:tcPr>
+          <w:p>
+            <w:r>
+              <w:rPr>
+                <w:sz w:val="13"/>
+              </w:rPr>
+              <w:t>Complete Browse Flow</w:t>
+            </w:r>
+          </w:p>
+        </w:tc>
+        <w:tc>
+          <w:tcPr>
+            <w:tcW w:w="1759" w:type="dxa"/>
+          </w:tcPr>
+          <w:p>
+            <w:r>
+              <w:rPr>
+                <w:sz w:val="13"/>
+              </w:rPr>
+              <w:t>End-to-end: browse list then view details</w:t>
+            </w:r>
+          </w:p>
+        </w:tc>
+        <w:tc>
+          <w:tcPr>
+            <w:tcW w:w="1759" w:type="dxa"/>
+          </w:tcPr>
+          <w:p>
+            <w:r>
+              <w:rPr>
+                <w:sz w:val="13"/>
+              </w:rPr>
+              <w:t>Events exist</w:t>
+            </w:r>
+          </w:p>
+        </w:tc>
+        <w:tc>
+          <w:tcPr>
+            <w:tcW w:w="1759" w:type="dxa"/>
+          </w:tcPr>
+          <w:p>
+            <w:r>
+              <w:rPr>
+                <w:sz w:val="13"/>
+              </w:rPr>
+              <w:t>1. Open events page.</w:t>
+              <w:br/>
+              <w:t>2. Select an event.</w:t>
+              <w:br/>
+              <w:t>3. View details.</w:t>
+            </w:r>
+          </w:p>
+        </w:tc>
+        <w:tc>
+          <w:tcPr>
+            <w:tcW w:w="1759" w:type="dxa"/>
+          </w:tcPr>
+          <w:p>
+            <w:r>
+              <w:rPr>
+                <w:sz w:val="13"/>
+              </w:rPr>
+              <w:t>Valid event</w:t>
+            </w:r>
+          </w:p>
+        </w:tc>
+        <w:tc>
+          <w:tcPr>
+            <w:tcW w:w="1759" w:type="dxa"/>
+          </w:tcPr>
+          <w:p>
+            <w:r>
+              <w:rPr>
+                <w:sz w:val="13"/>
+              </w:rPr>
+              <w:t>Attendee sees the list, then the correct details, without errors</w:t>
+            </w:r>
+          </w:p>
+        </w:tc>
+        <w:tc>
+          <w:tcPr>
+            <w:tcW w:w="1759" w:type="dxa"/>
+          </w:tcPr>
+          <w:p/>
+        </w:tc>
+        <w:tc>
+          <w:tcPr>
+            <w:tcW w:w="1759" w:type="dxa"/>
+          </w:tcPr>
+          <w:p/>
+        </w:tc>
+      </w:tr>
+      <w:tr>
+        <w:tblPrEx>
+          <w:tblCellMar>
+            <w:top w:w="0" w:type="dxa"/>
+            <w:bottom w:w="0" w:type="dxa"/>
+          </w:tblCellMar>
+        </w:tblPrEx>
+        <w:trPr>
+          <w:jc w:val="center"/>
+        </w:trPr>
+        <w:tc>
+          <w:tcPr>
+            <w:tcW w:w="1759" w:type="dxa"/>
+          </w:tcPr>
+          <w:p>
+            <w:r>
+              <w:rPr>
+                <w:sz w:val="13"/>
+              </w:rPr>
+              <w:t>REQ3_ST_02</w:t>
+            </w:r>
+          </w:p>
+        </w:tc>
+        <w:tc>
+          <w:tcPr>
+            <w:tcW w:w="1759" w:type="dxa"/>
+          </w:tcPr>
+          <w:p>
+            <w:r>
+              <w:rPr>
+                <w:sz w:val="13"/>
+              </w:rPr>
+              <w:t>Complete Browse Flow</w:t>
+            </w:r>
+          </w:p>
+        </w:tc>
+        <w:tc>
+          <w:tcPr>
+            <w:tcW w:w="1759" w:type="dxa"/>
+          </w:tcPr>
+          <w:p>
+            <w:r>
+              <w:rPr>
+                <w:sz w:val="13"/>
+              </w:rPr>
+              <w:t>Verify only upcoming (not past) events are listed</w:t>
+            </w:r>
+          </w:p>
+        </w:tc>
+        <w:tc>
+          <w:tcPr>
+            <w:tcW w:w="1759" w:type="dxa"/>
+          </w:tcPr>
+          <w:p>
+            <w:r>
+              <w:rPr>
+                <w:sz w:val="13"/>
+              </w:rPr>
+              <w:t>Mix of past and future events exist</w:t>
+            </w:r>
+          </w:p>
+        </w:tc>
+        <w:tc>
+          <w:tcPr>
+            <w:tcW w:w="1759" w:type="dxa"/>
+          </w:tcPr>
+          <w:p>
+            <w:r>
+              <w:rPr>
+                <w:sz w:val="13"/>
+              </w:rPr>
+              <w:t>1. Open events page</w:t>
+            </w:r>
+          </w:p>
+        </w:tc>
+        <w:tc>
+          <w:tcPr>
+            <w:tcW w:w="1759" w:type="dxa"/>
+          </w:tcPr>
+          <w:p>
+            <w:r>
+              <w:rPr>
+                <w:sz w:val="13"/>
+              </w:rPr>
+              <w:t>Past + future events</w:t>
+            </w:r>
+          </w:p>
+        </w:tc>
+        <w:tc>
+          <w:tcPr>
+            <w:tcW w:w="1759" w:type="dxa"/>
+          </w:tcPr>
+          <w:p>
+            <w:r>
+              <w:rPr>
+                <w:sz w:val="13"/>
+              </w:rPr>
+              <w:t>Only upcoming events appear in the list</w:t>
+            </w:r>
+          </w:p>
+        </w:tc>
+        <w:tc>
+          <w:tcPr>
+            <w:tcW w:w="1759" w:type="dxa"/>
+          </w:tcPr>
+          <w:p/>
+        </w:tc>
+        <w:tc>
+          <w:tcPr>
+            <w:tcW w:w="1759" w:type="dxa"/>
+          </w:tcPr>
+          <w:p/>
+        </w:tc>
+      </w:tr>
+      <w:tr>
+        <w:tblPrEx>
+          <w:tblCellMar>
+            <w:top w:w="0" w:type="dxa"/>
+            <w:bottom w:w="0" w:type="dxa"/>
+          </w:tblCellMar>
+        </w:tblPrEx>
+        <w:trPr>
+          <w:jc w:val="center"/>
+        </w:trPr>
+        <w:tc>
+          <w:tcPr>
+            <w:tcW w:w="1759" w:type="dxa"/>
+          </w:tcPr>
+          <w:p>
+            <w:r>
+              <w:rPr>
+                <w:sz w:val="13"/>
+              </w:rPr>
+              <w:t>REQ4_UT_01</w:t>
+            </w:r>
+          </w:p>
+        </w:tc>
+        <w:tc>
+          <w:tcPr>
+            <w:tcW w:w="1759" w:type="dxa"/>
+          </w:tcPr>
+          <w:p>
+            <w:r>
+              <w:rPr>
+                <w:sz w:val="13"/>
+              </w:rPr>
+              <w:t>Registration</w:t>
+            </w:r>
+          </w:p>
+        </w:tc>
+        <w:tc>
+          <w:tcPr>
+            <w:tcW w:w="1759" w:type="dxa"/>
+          </w:tcPr>
+          <w:p>
+            <w:r>
+              <w:rPr>
+                <w:sz w:val="13"/>
+              </w:rPr>
+              <w:t>Register with valid name and email</w:t>
+            </w:r>
+          </w:p>
+        </w:tc>
+        <w:tc>
+          <w:tcPr>
+            <w:tcW w:w="1759" w:type="dxa"/>
+          </w:tcPr>
+          <w:p>
+            <w:r>
+              <w:rPr>
+                <w:sz w:val="13"/>
+              </w:rPr>
+              <w:t>Event exists</w:t>
+            </w:r>
+          </w:p>
+        </w:tc>
+        <w:tc>
+          <w:tcPr>
+            <w:tcW w:w="1759" w:type="dxa"/>
+          </w:tcPr>
+          <w:p>
+            <w:r>
+              <w:rPr>
+                <w:sz w:val="13"/>
+              </w:rPr>
+              <w:t>1. Open event.</w:t>
+              <w:br/>
+              <w:t>2. Fill form.</w:t>
+              <w:br/>
+              <w:t>3. Submit.</w:t>
+            </w:r>
+          </w:p>
+        </w:tc>
+        <w:tc>
+          <w:tcPr>
+            <w:tcW w:w="1759" w:type="dxa"/>
+          </w:tcPr>
+          <w:p>
+            <w:r>
+              <w:rPr>
+                <w:sz w:val="13"/>
+              </w:rPr>
+              <w:t>Name: Asha Rao</w:t>
+              <w:br/>
+              <w:t>Email: asha@example.com</w:t>
+            </w:r>
+          </w:p>
+        </w:tc>
+        <w:tc>
+          <w:tcPr>
+            <w:tcW w:w="1759" w:type="dxa"/>
+          </w:tcPr>
+          <w:p>
+            <w:r>
+              <w:rPr>
+                <w:sz w:val="13"/>
+              </w:rPr>
+              <w:t>Registration succeeds, confirmation message shown</w:t>
+            </w:r>
+          </w:p>
+        </w:tc>
+        <w:tc>
+          <w:tcPr>
+            <w:tcW w:w="1759" w:type="dxa"/>
+          </w:tcPr>
+          <w:p/>
+        </w:tc>
+        <w:tc>
+          <w:tcPr>
+            <w:tcW w:w="1759" w:type="dxa"/>
+          </w:tcPr>
+          <w:p/>
+        </w:tc>
+      </w:tr>
+      <w:tr>
+        <w:tblPrEx>
+          <w:tblCellMar>
+            <w:top w:w="0" w:type="dxa"/>
+            <w:bottom w:w="0" w:type="dxa"/>
+          </w:tblCellMar>
+        </w:tblPrEx>
+        <w:trPr>
+          <w:jc w:val="center"/>
+        </w:trPr>
+        <w:tc>
+          <w:tcPr>
+            <w:tcW w:w="1759" w:type="dxa"/>
+          </w:tcPr>
+          <w:p>
+            <w:r>
+              <w:rPr>
+                <w:sz w:val="13"/>
+              </w:rPr>
+              <w:t>REQ4_UT_02</w:t>
+            </w:r>
+          </w:p>
+        </w:tc>
+        <w:tc>
+          <w:tcPr>
+            <w:tcW w:w="1759" w:type="dxa"/>
+          </w:tcPr>
+          <w:p>
+            <w:r>
+              <w:rPr>
+                <w:sz w:val="13"/>
+              </w:rPr>
+              <w:t>Registration</w:t>
+            </w:r>
+          </w:p>
+        </w:tc>
+        <w:tc>
+          <w:tcPr>
+            <w:tcW w:w="1759" w:type="dxa"/>
+          </w:tcPr>
+          <w:p>
+            <w:r>
+              <w:rPr>
+                <w:sz w:val="13"/>
+              </w:rPr>
+              <w:t>Missing name</w:t>
+            </w:r>
+          </w:p>
+        </w:tc>
+        <w:tc>
+          <w:tcPr>
+            <w:tcW w:w="1759" w:type="dxa"/>
+          </w:tcPr>
+          <w:p>
+            <w:r>
+              <w:rPr>
+                <w:sz w:val="13"/>
+              </w:rPr>
+              <w:t>Event exists</w:t>
+            </w:r>
+          </w:p>
+        </w:tc>
+        <w:tc>
+          <w:tcPr>
+            <w:tcW w:w="1759" w:type="dxa"/>
+          </w:tcPr>
+          <w:p>
+            <w:r>
+              <w:rPr>
+                <w:sz w:val="13"/>
+              </w:rPr>
+              <w:t>1. Leave name blank.</w:t>
+              <w:br/>
+              <w:t>2. Submit.</w:t>
+            </w:r>
+          </w:p>
+        </w:tc>
+        <w:tc>
+          <w:tcPr>
+            <w:tcW w:w="1759" w:type="dxa"/>
+          </w:tcPr>
+          <w:p>
+            <w:r>
+              <w:rPr>
+                <w:sz w:val="13"/>
+              </w:rPr>
+              <w:t>Name: blank; valid email</w:t>
+            </w:r>
+          </w:p>
+        </w:tc>
+        <w:tc>
+          <w:tcPr>
+            <w:tcW w:w="1759" w:type="dxa"/>
+          </w:tcPr>
+          <w:p>
+            <w:r>
+              <w:rPr>
+                <w:sz w:val="13"/>
+              </w:rPr>
+              <w:t>System rejects submission and shows an error for the missing name</w:t>
+            </w:r>
+          </w:p>
+        </w:tc>
+        <w:tc>
+          <w:tcPr>
+            <w:tcW w:w="1759" w:type="dxa"/>
+          </w:tcPr>
+          <w:p/>
+        </w:tc>
+        <w:tc>
+          <w:tcPr>
+            <w:tcW w:w="1759" w:type="dxa"/>
+          </w:tcPr>
+          <w:p/>
+        </w:tc>
+      </w:tr>
+      <w:tr>
+        <w:tblPrEx>
+          <w:tblCellMar>
+            <w:top w:w="0" w:type="dxa"/>
+            <w:bottom w:w="0" w:type="dxa"/>
+          </w:tblCellMar>
+        </w:tblPrEx>
+        <w:trPr>
+          <w:jc w:val="center"/>
+        </w:trPr>
+        <w:tc>
+          <w:tcPr>
+            <w:tcW w:w="1759" w:type="dxa"/>
+          </w:tcPr>
+          <w:p>
+            <w:r>
+              <w:rPr>
+                <w:sz w:val="13"/>
+              </w:rPr>
+              <w:t>REQ4_UT_03</w:t>
+            </w:r>
+          </w:p>
+        </w:tc>
+        <w:tc>
+          <w:tcPr>
+            <w:tcW w:w="1759" w:type="dxa"/>
+          </w:tcPr>
+          <w:p>
+            <w:r>
+              <w:rPr>
+                <w:sz w:val="13"/>
+              </w:rPr>
+              <w:t>Registration</w:t>
+            </w:r>
+          </w:p>
+        </w:tc>
+        <w:tc>
+          <w:tcPr>
+            <w:tcW w:w="1759" w:type="dxa"/>
+          </w:tcPr>
+          <w:p>
+            <w:r>
+              <w:rPr>
+                <w:sz w:val="13"/>
+              </w:rPr>
+              <w:t>Invalid or missing email format</w:t>
+            </w:r>
+          </w:p>
+        </w:tc>
+        <w:tc>
+          <w:tcPr>
+            <w:tcW w:w="1759" w:type="dxa"/>
+          </w:tcPr>
+          <w:p>
+            <w:r>
+              <w:rPr>
+                <w:sz w:val="13"/>
+              </w:rPr>
+              <w:t>Event exists</w:t>
+            </w:r>
+          </w:p>
+        </w:tc>
+        <w:tc>
+          <w:tcPr>
+            <w:tcW w:w="1759" w:type="dxa"/>
+          </w:tcPr>
+          <w:p>
+            <w:r>
+              <w:rPr>
+                <w:sz w:val="13"/>
+              </w:rPr>
+              <w:t>1. Enter invalid email format.</w:t>
+              <w:br/>
+              <w:t>2. Submit.</w:t>
+            </w:r>
+          </w:p>
+        </w:tc>
+        <w:tc>
+          <w:tcPr>
+            <w:tcW w:w="1759" w:type="dxa"/>
+          </w:tcPr>
+          <w:p>
+            <w:r>
+              <w:rPr>
+                <w:sz w:val="13"/>
+              </w:rPr>
+              <w:t>Email: not-an-email</w:t>
+            </w:r>
+          </w:p>
+        </w:tc>
+        <w:tc>
+          <w:tcPr>
+            <w:tcW w:w="1759" w:type="dxa"/>
+          </w:tcPr>
+          <w:p>
+            <w:r>
+              <w:rPr>
+                <w:sz w:val="13"/>
+              </w:rPr>
+              <w:t>System rejects submission and shows an email validation error</w:t>
+            </w:r>
+          </w:p>
+        </w:tc>
+        <w:tc>
+          <w:tcPr>
+            <w:tcW w:w="1759" w:type="dxa"/>
+          </w:tcPr>
+          <w:p/>
+        </w:tc>
+        <w:tc>
+          <w:tcPr>
+            <w:tcW w:w="1759" w:type="dxa"/>
+          </w:tcPr>
+          <w:p/>
+        </w:tc>
+      </w:tr>
+      <w:tr>
+        <w:tblPrEx>
+          <w:tblCellMar>
+            <w:top w:w="0" w:type="dxa"/>
+            <w:bottom w:w="0" w:type="dxa"/>
+          </w:tblCellMar>
+        </w:tblPrEx>
+        <w:trPr>
+          <w:jc w:val="center"/>
+        </w:trPr>
+        <w:tc>
+          <w:tcPr>
+            <w:tcW w:w="1759" w:type="dxa"/>
+          </w:tcPr>
+          <w:p>
+            <w:r>
+              <w:rPr>
+                <w:sz w:val="13"/>
+              </w:rPr>
+              <w:t>REQ4_UT_04</w:t>
+            </w:r>
+          </w:p>
+        </w:tc>
+        <w:tc>
+          <w:tcPr>
+            <w:tcW w:w="1759" w:type="dxa"/>
+          </w:tcPr>
+          <w:p>
+            <w:r>
+              <w:rPr>
+                <w:sz w:val="13"/>
+              </w:rPr>
+              <w:t>Duplicate Prevention</w:t>
+            </w:r>
+          </w:p>
+        </w:tc>
+        <w:tc>
+          <w:tcPr>
+            <w:tcW w:w="1759" w:type="dxa"/>
+          </w:tcPr>
+          <w:p>
+            <w:r>
+              <w:rPr>
+                <w:sz w:val="13"/>
+              </w:rPr>
+              <w:t>Reject duplicate registration with same email for same event</w:t>
+            </w:r>
+          </w:p>
+        </w:tc>
+        <w:tc>
+          <w:tcPr>
+            <w:tcW w:w="1759" w:type="dxa"/>
+          </w:tcPr>
+          <w:p>
+            <w:r>
+              <w:rPr>
+                <w:sz w:val="13"/>
+              </w:rPr>
+              <w:t>Attendee already registered once for this event</w:t>
+            </w:r>
+          </w:p>
+        </w:tc>
+        <w:tc>
+          <w:tcPr>
+            <w:tcW w:w="1759" w:type="dxa"/>
+          </w:tcPr>
+          <w:p>
+            <w:r>
+              <w:rPr>
+                <w:sz w:val="13"/>
+              </w:rPr>
+              <w:t>1. Submit registration again with the same email for the same event.</w:t>
+            </w:r>
+          </w:p>
+        </w:tc>
+        <w:tc>
+          <w:tcPr>
+            <w:tcW w:w="1759" w:type="dxa"/>
+          </w:tcPr>
+          <w:p>
+            <w:r>
+              <w:rPr>
+                <w:sz w:val="13"/>
+              </w:rPr>
+              <w:t>Same email as existing registration</w:t>
+            </w:r>
+          </w:p>
+        </w:tc>
+        <w:tc>
+          <w:tcPr>
+            <w:tcW w:w="1759" w:type="dxa"/>
+          </w:tcPr>
+          <w:p>
+            <w:r>
+              <w:rPr>
+                <w:sz w:val="13"/>
+              </w:rPr>
+              <w:t>System rejects with a duplicate-registration error; no new record is created</w:t>
+            </w:r>
+          </w:p>
+        </w:tc>
+        <w:tc>
+          <w:tcPr>
+            <w:tcW w:w="1759" w:type="dxa"/>
+          </w:tcPr>
+          <w:p/>
+        </w:tc>
+        <w:tc>
+          <w:tcPr>
+            <w:tcW w:w="1759" w:type="dxa"/>
+          </w:tcPr>
+          <w:p/>
+        </w:tc>
+      </w:tr>
+      <w:tr>
+        <w:tblPrEx>
+          <w:tblCellMar>
+            <w:top w:w="0" w:type="dxa"/>
+            <w:bottom w:w="0" w:type="dxa"/>
+          </w:tblCellMar>
+        </w:tblPrEx>
+        <w:trPr>
+          <w:jc w:val="center"/>
+        </w:trPr>
+        <w:tc>
+          <w:tcPr>
+            <w:tcW w:w="1759" w:type="dxa"/>
+          </w:tcPr>
+          <w:p>
+            <w:r>
+              <w:rPr>
+                <w:sz w:val="13"/>
+              </w:rPr>
+              <w:t>REQ4_IT_01</w:t>
+            </w:r>
+          </w:p>
+        </w:tc>
+        <w:tc>
+          <w:tcPr>
+            <w:tcW w:w="1759" w:type="dxa"/>
+          </w:tcPr>
+          <w:p>
+            <w:r>
+              <w:rPr>
+                <w:sz w:val="13"/>
+              </w:rPr>
+              <w:t>Frontend + Backend</w:t>
+            </w:r>
+          </w:p>
+        </w:tc>
+        <w:tc>
+          <w:tcPr>
+            <w:tcW w:w="1759" w:type="dxa"/>
+          </w:tcPr>
+          <w:p>
+            <w:r>
+              <w:rPr>
+                <w:sz w:val="13"/>
+              </w:rPr>
+              <w:t>Registration data sent correctly to backend</w:t>
+            </w:r>
+          </w:p>
+        </w:tc>
+        <w:tc>
+          <w:tcPr>
+            <w:tcW w:w="1759" w:type="dxa"/>
+          </w:tcPr>
+          <w:p>
+            <w:r>
+              <w:rPr>
+                <w:sz w:val="13"/>
+              </w:rPr>
+              <w:t>Event exists</w:t>
+            </w:r>
+          </w:p>
+        </w:tc>
+        <w:tc>
+          <w:tcPr>
+            <w:tcW w:w="1759" w:type="dxa"/>
+          </w:tcPr>
+          <w:p>
+            <w:r>
+              <w:rPr>
+                <w:sz w:val="13"/>
+              </w:rPr>
+              <w:t>1. Fill and submit form.</w:t>
+            </w:r>
+          </w:p>
+        </w:tc>
+        <w:tc>
+          <w:tcPr>
+            <w:tcW w:w="1759" w:type="dxa"/>
+          </w:tcPr>
+          <w:p>
+            <w:r>
+              <w:rPr>
+                <w:sz w:val="13"/>
+              </w:rPr>
+              <w:t>Valid name/email</w:t>
+            </w:r>
+          </w:p>
+        </w:tc>
+        <w:tc>
+          <w:tcPr>
+            <w:tcW w:w="1759" w:type="dxa"/>
+          </w:tcPr>
+          <w:p>
+            <w:r>
+              <w:rPr>
+                <w:sz w:val="13"/>
+              </w:rPr>
+              <w:t>Backend receives the correct payload and processes it</w:t>
+            </w:r>
+          </w:p>
+        </w:tc>
+        <w:tc>
+          <w:tcPr>
+            <w:tcW w:w="1759" w:type="dxa"/>
+          </w:tcPr>
+          <w:p/>
+        </w:tc>
+        <w:tc>
+          <w:tcPr>
+            <w:tcW w:w="1759" w:type="dxa"/>
+          </w:tcPr>
+          <w:p/>
+        </w:tc>
+      </w:tr>
+      <w:tr>
+        <w:tblPrEx>
+          <w:tblCellMar>
+            <w:top w:w="0" w:type="dxa"/>
+            <w:bottom w:w="0" w:type="dxa"/>
+          </w:tblCellMar>
+        </w:tblPrEx>
+        <w:trPr>
+          <w:jc w:val="center"/>
+        </w:trPr>
+        <w:tc>
+          <w:tcPr>
+            <w:tcW w:w="1759" w:type="dxa"/>
+          </w:tcPr>
+          <w:p>
+            <w:r>
+              <w:rPr>
+                <w:sz w:val="13"/>
+              </w:rPr>
+              <w:t>REQ4_IT_02</w:t>
+            </w:r>
+          </w:p>
+        </w:tc>
+        <w:tc>
+          <w:tcPr>
+            <w:tcW w:w="1759" w:type="dxa"/>
+          </w:tcPr>
+          <w:p>
+            <w:r>
+              <w:rPr>
+                <w:sz w:val="13"/>
+              </w:rPr>
+              <w:t>Backend + Database</w:t>
+            </w:r>
+          </w:p>
+        </w:tc>
+        <w:tc>
+          <w:tcPr>
+            <w:tcW w:w="1759" w:type="dxa"/>
+          </w:tcPr>
+          <w:p>
+            <w:r>
+              <w:rPr>
+                <w:sz w:val="13"/>
+              </w:rPr>
+              <w:t>Registration record saved in database</w:t>
+            </w:r>
+          </w:p>
+        </w:tc>
+        <w:tc>
+          <w:tcPr>
+            <w:tcW w:w="1759" w:type="dxa"/>
+          </w:tcPr>
+          <w:p>
+            <w:r>
+              <w:rPr>
+                <w:sz w:val="13"/>
+              </w:rPr>
+              <w:t>Backend and database available</w:t>
+            </w:r>
+          </w:p>
+        </w:tc>
+        <w:tc>
+          <w:tcPr>
+            <w:tcW w:w="1759" w:type="dxa"/>
+          </w:tcPr>
+          <w:p>
+            <w:r>
+              <w:rPr>
+                <w:sz w:val="13"/>
+              </w:rPr>
+              <w:t>1. Submit valid registration.</w:t>
+            </w:r>
+          </w:p>
+        </w:tc>
+        <w:tc>
+          <w:tcPr>
+            <w:tcW w:w="1759" w:type="dxa"/>
+          </w:tcPr>
+          <w:p>
+            <w:r>
+              <w:rPr>
+                <w:sz w:val="13"/>
+              </w:rPr>
+              <w:t>Valid name/email</w:t>
+            </w:r>
+          </w:p>
+        </w:tc>
+        <w:tc>
+          <w:tcPr>
+            <w:tcW w:w="1759" w:type="dxa"/>
+          </w:tcPr>
+          <w:p>
+            <w:r>
+              <w:rPr>
+                <w:sz w:val="13"/>
+              </w:rPr>
+              <w:t>Record is correctly stored with its event association</w:t>
+            </w:r>
+          </w:p>
+        </w:tc>
+        <w:tc>
+          <w:tcPr>
+            <w:tcW w:w="1759" w:type="dxa"/>
+          </w:tcPr>
+          <w:p/>
+        </w:tc>
+        <w:tc>
+          <w:tcPr>
+            <w:tcW w:w="1759" w:type="dxa"/>
+          </w:tcPr>
+          <w:p/>
+        </w:tc>
+      </w:tr>
+      <w:tr>
+        <w:tblPrEx>
+          <w:tblCellMar>
+            <w:top w:w="0" w:type="dxa"/>
+            <w:bottom w:w="0" w:type="dxa"/>
+          </w:tblCellMar>
+        </w:tblPrEx>
+        <w:trPr>
+          <w:jc w:val="center"/>
+        </w:trPr>
+        <w:tc>
+          <w:tcPr>
+            <w:tcW w:w="1759" w:type="dxa"/>
+          </w:tcPr>
+          <w:p>
+            <w:r>
+              <w:rPr>
+                <w:sz w:val="13"/>
+              </w:rPr>
+              <w:t>REQ4_IT_03</w:t>
+            </w:r>
+          </w:p>
+        </w:tc>
+        <w:tc>
+          <w:tcPr>
+            <w:tcW w:w="1759" w:type="dxa"/>
+          </w:tcPr>
+          <w:p>
+            <w:r>
+              <w:rPr>
+                <w:sz w:val="13"/>
+              </w:rPr>
+              <w:t>Backend + Database</w:t>
+            </w:r>
+          </w:p>
+        </w:tc>
+        <w:tc>
+          <w:tcPr>
+            <w:tcW w:w="1759" w:type="dxa"/>
+          </w:tcPr>
+          <w:p>
+            <w:r>
+              <w:rPr>
+                <w:sz w:val="13"/>
+              </w:rPr>
+              <w:t>Backend checks for duplicates before saving</w:t>
+            </w:r>
+          </w:p>
+        </w:tc>
+        <w:tc>
+          <w:tcPr>
+            <w:tcW w:w="1759" w:type="dxa"/>
+          </w:tcPr>
+          <w:p>
+            <w:r>
+              <w:rPr>
+                <w:sz w:val="13"/>
+              </w:rPr>
+              <w:t>Existing registration for that email and event</w:t>
+            </w:r>
+          </w:p>
+        </w:tc>
+        <w:tc>
+          <w:tcPr>
+            <w:tcW w:w="1759" w:type="dxa"/>
+          </w:tcPr>
+          <w:p>
+            <w:r>
+              <w:rPr>
+                <w:sz w:val="13"/>
+              </w:rPr>
+              <w:t>1. Submit registration with the same email.</w:t>
+            </w:r>
+          </w:p>
+        </w:tc>
+        <w:tc>
+          <w:tcPr>
+            <w:tcW w:w="1759" w:type="dxa"/>
+          </w:tcPr>
+          <w:p>
+            <w:r>
+              <w:rPr>
+                <w:sz w:val="13"/>
+              </w:rPr>
+              <w:t>Duplicate email</w:t>
+            </w:r>
+          </w:p>
+        </w:tc>
+        <w:tc>
+          <w:tcPr>
+            <w:tcW w:w="1759" w:type="dxa"/>
+          </w:tcPr>
+          <w:p>
+            <w:r>
+              <w:rPr>
+                <w:sz w:val="13"/>
+              </w:rPr>
+              <w:t>Backend detects the existing record and blocks the insert</w:t>
+            </w:r>
+          </w:p>
+        </w:tc>
+        <w:tc>
+          <w:tcPr>
+            <w:tcW w:w="1759" w:type="dxa"/>
+          </w:tcPr>
+          <w:p/>
+        </w:tc>
+        <w:tc>
+          <w:tcPr>
+            <w:tcW w:w="1759" w:type="dxa"/>
+          </w:tcPr>
+          <w:p/>
+        </w:tc>
+      </w:tr>
+      <w:tr>
+        <w:tblPrEx>
+          <w:tblCellMar>
+            <w:top w:w="0" w:type="dxa"/>
+            <w:bottom w:w="0" w:type="dxa"/>
+          </w:tblCellMar>
+        </w:tblPrEx>
+        <w:trPr>
+          <w:jc w:val="center"/>
+        </w:trPr>
+        <w:tc>
+          <w:tcPr>
+            <w:tcW w:w="1759" w:type="dxa"/>
+          </w:tcPr>
+          <w:p>
+            <w:r>
+              <w:rPr>
+                <w:sz w:val="13"/>
+              </w:rPr>
+              <w:t>REQ4_ST_01</w:t>
+            </w:r>
+          </w:p>
+        </w:tc>
+        <w:tc>
+          <w:tcPr>
+            <w:tcW w:w="1759" w:type="dxa"/>
+          </w:tcPr>
+          <w:p>
+            <w:r>
+              <w:rPr>
+                <w:sz w:val="13"/>
+              </w:rPr>
+              <w:t>Complete Registration Flow</w:t>
+            </w:r>
+          </w:p>
+        </w:tc>
+        <w:tc>
+          <w:tcPr>
+            <w:tcW w:w="1759" w:type="dxa"/>
+          </w:tcPr>
+          <w:p>
+            <w:r>
+              <w:rPr>
+                <w:sz w:val="13"/>
+              </w:rPr>
+              <w:t>End-to-end successful registration</w:t>
+            </w:r>
+          </w:p>
+        </w:tc>
+        <w:tc>
+          <w:tcPr>
+            <w:tcW w:w="1759" w:type="dxa"/>
+          </w:tcPr>
+          <w:p>
+            <w:r>
+              <w:rPr>
+                <w:sz w:val="13"/>
+              </w:rPr>
+              <w:t>Attendee has not registered before</w:t>
+            </w:r>
+          </w:p>
+        </w:tc>
+        <w:tc>
+          <w:tcPr>
+            <w:tcW w:w="1759" w:type="dxa"/>
+          </w:tcPr>
+          <w:p>
+            <w:r>
+              <w:rPr>
+                <w:sz w:val="13"/>
+              </w:rPr>
+              <w:t>1. Browse events.</w:t>
+              <w:br/>
+              <w:t>2. Select event.</w:t>
+              <w:br/>
+              <w:t>3. Register.</w:t>
+              <w:br/>
+              <w:t>4. See confirmation.</w:t>
+            </w:r>
+          </w:p>
+        </w:tc>
+        <w:tc>
+          <w:tcPr>
+            <w:tcW w:w="1759" w:type="dxa"/>
+          </w:tcPr>
+          <w:p>
+            <w:r>
+              <w:rPr>
+                <w:sz w:val="13"/>
+              </w:rPr>
+              <w:t>Valid name/email</w:t>
+            </w:r>
+          </w:p>
+        </w:tc>
+        <w:tc>
+          <w:tcPr>
+            <w:tcW w:w="1759" w:type="dxa"/>
+          </w:tcPr>
+          <w:p>
+            <w:r>
+              <w:rPr>
+                <w:sz w:val="13"/>
+              </w:rPr>
+              <w:t>Registration completes and a confirmation is shown</w:t>
+            </w:r>
+          </w:p>
+        </w:tc>
+        <w:tc>
+          <w:tcPr>
+            <w:tcW w:w="1759" w:type="dxa"/>
+          </w:tcPr>
+          <w:p/>
+        </w:tc>
+        <w:tc>
+          <w:tcPr>
+            <w:tcW w:w="1759" w:type="dxa"/>
+          </w:tcPr>
+          <w:p/>
+        </w:tc>
+      </w:tr>
+      <w:tr>
+        <w:tblPrEx>
+          <w:tblCellMar>
+            <w:top w:w="0" w:type="dxa"/>
+            <w:bottom w:w="0" w:type="dxa"/>
+          </w:tblCellMar>
+        </w:tblPrEx>
+        <w:trPr>
+          <w:jc w:val="center"/>
+        </w:trPr>
+        <w:tc>
+          <w:tcPr>
+            <w:tcW w:w="1759" w:type="dxa"/>
+          </w:tcPr>
+          <w:p>
+            <w:r>
+              <w:rPr>
+                <w:sz w:val="13"/>
+              </w:rPr>
+              <w:t>REQ4_ST_02</w:t>
+            </w:r>
+          </w:p>
+        </w:tc>
+        <w:tc>
+          <w:tcPr>
+            <w:tcW w:w="1759" w:type="dxa"/>
+          </w:tcPr>
+          <w:p>
+            <w:r>
+              <w:rPr>
+                <w:sz w:val="13"/>
+              </w:rPr>
+              <w:t>Complete Duplicate-Prevention Flow</w:t>
+            </w:r>
+          </w:p>
+        </w:tc>
+        <w:tc>
+          <w:tcPr>
+            <w:tcW w:w="1759" w:type="dxa"/>
+          </w:tcPr>
+          <w:p>
+            <w:r>
+              <w:rPr>
+                <w:sz w:val="13"/>
+              </w:rPr>
+              <w:t>Full duplicate rejection workflow</w:t>
+            </w:r>
+          </w:p>
+        </w:tc>
+        <w:tc>
+          <w:tcPr>
+            <w:tcW w:w="1759" w:type="dxa"/>
+          </w:tcPr>
+          <w:p>
+            <w:r>
+              <w:rPr>
+                <w:sz w:val="13"/>
+              </w:rPr>
+              <w:t>Attendee already registered</w:t>
+            </w:r>
+          </w:p>
+        </w:tc>
+        <w:tc>
+          <w:tcPr>
+            <w:tcW w:w="1759" w:type="dxa"/>
+          </w:tcPr>
+          <w:p>
+            <w:r>
+              <w:rPr>
+                <w:sz w:val="13"/>
+              </w:rPr>
+              <w:t>1. Register once (success).</w:t>
+              <w:br/>
+              <w:t>2. Attempt a second registration with the same email for the same event.</w:t>
+            </w:r>
+          </w:p>
+        </w:tc>
+        <w:tc>
+          <w:tcPr>
+            <w:tcW w:w="1759" w:type="dxa"/>
+          </w:tcPr>
+          <w:p>
+            <w:r>
+              <w:rPr>
+                <w:sz w:val="13"/>
+              </w:rPr>
+              <w:t>Same email twice</w:t>
+            </w:r>
+          </w:p>
+        </w:tc>
+        <w:tc>
+          <w:tcPr>
+            <w:tcW w:w="1759" w:type="dxa"/>
+          </w:tcPr>
+          <w:p>
+            <w:r>
+              <w:rPr>
+                <w:sz w:val="13"/>
+              </w:rPr>
+              <w:t>First attempt succeeds, second is rejected with a clear error; only one database record exists</w:t>
             </w:r>
           </w:p>
         </w:tc>

</xml_diff>